<commit_message>
Completed assignment waiting for review
</commit_message>
<xml_diff>
--- a/projekti-2-koneoppimisalgoritmit/reports/Anton_Teerioja_harjoitus_2_klusterointi.docx
+++ b/projekti-2-koneoppimisalgoritmit/reports/Anton_Teerioja_harjoitus_2_klusterointi.docx
@@ -12,6 +12,9 @@
       <w:r>
         <w:t>käytän tilastotieteen perusmenetelmiä sekä ohjaamattoman oppimisen menetelmiä annetun datan kuvailuun ja analyysiin. Työn tarkoituksena on valmistella data analyysiä varten, tehdä analyysi datalle, vastata tutkimuskysymyksiin sekä esittää yhteenveto analyysistä.</w:t>
       </w:r>
+      <w:r>
+        <w:t xml:space="preserve"> Tehtävänannossa on kaksi tutkimuskysymystä. Ensimmäinen tutkimuskysymys on kuka biologeista luokittelu puut parhaiten. Toinen tutkimuskysymys on tunnistaa datasta parhaiten luokittelevat attribuutit.</w:t>
+      </w:r>
     </w:p>
     <w:p>
       <w:pPr>
@@ -43,23 +46,7 @@
     </w:p>
     <w:p>
       <w:r>
-        <w:t xml:space="preserve">Käytetään numeerisia ja kategorisia muuttujia analyysiin ja </w:t>
-      </w:r>
-      <w:proofErr w:type="spellStart"/>
-      <w:r>
-        <w:t>klusterointiin</w:t>
-      </w:r>
-      <w:proofErr w:type="spellEnd"/>
-      <w:r>
-        <w:t xml:space="preserve">. Verrataan </w:t>
-      </w:r>
-      <w:proofErr w:type="spellStart"/>
-      <w:r>
-        <w:t>klusterointia</w:t>
-      </w:r>
-      <w:proofErr w:type="spellEnd"/>
-      <w:r>
-        <w:t xml:space="preserve"> tutkijoiden luokitteluun, jonka avulla voidaan arvioida ovatko tutkijat onnistuneet puiden luokittelussa. Käytetään numeerisia ja kategorisia muuttujia selvittämään mitkä muuttujat ovat enemmän ja mitkä vähemmän informatiivisia, jotta jatkossa voidaan vähentää turhan datan keruuta.</w:t>
+        <w:t>Käytetään numeerisia ja kategorisia muuttujia analyysiin ja klusterointiin. Verrataan klusterointia tutkijoiden luokitteluun, jonka avulla voidaan arvioida ovatko tutkijat onnistuneet puiden luokittelussa. Käytetään numeerisia ja kategorisia muuttujia selvittämään mitkä muuttujat ovat enemmän ja mitkä vähemmän informatiivisia, jotta jatkossa voidaan vähentää turhan datan keruuta.</w:t>
       </w:r>
     </w:p>
     <w:p>
@@ -113,16 +100,6 @@
       </w:r>
       <w:r>
         <w:t xml:space="preserve"> sekä kvartaalit Q1, Q2 ja Q3. Näiden tilastojen vertaus toisiinsa ei ole mielekästä tässä vaiheessa, koska muuttujan skaala vaikuttaa näiden arvojen suuruuteen. Ainoa poikkeava arvo on käpyjen pienin lukumäärä, joka on -10. Tämä ei ole mahdollista, joten korjataan tilanne. Oletetaan, että negatiivinen etuliite on näppäilyvirhe ja otetaan jokaisen kävyn itseisarvo ja asetetaan se jokaisen rivin arvoksi tässä sarakkeessa.</w:t>
-      </w:r>
-    </w:p>
-    <w:p>
-      <w:pPr>
-        <w:tabs>
-          <w:tab w:val="left" w:pos="5780"/>
-        </w:tabs>
-      </w:pPr>
-      <w:r>
-        <w:tab/>
       </w:r>
     </w:p>
     <w:p>
@@ -502,10 +479,15 @@
         </w:drawing>
       </w:r>
     </w:p>
-    <w:p/>
-    <w:p>
-      <w:r>
-        <w:t>Kuvaajista huomataan kaikkien arvojen olevan lähes symmetrisesti jakautuneita. Suurimpia poikkeavia arvoja saadaan siemenen koolla, joka saa suurimman osan arvoistaan hyvin kapealta väliltä, mutta myös paljon poikkeavia arvoja.</w:t>
+    <w:p>
+      <w:r>
+        <w:t xml:space="preserve">Kuvaajista huomataan kaikkien arvojen olevan lähes symmetrisesti jakautuneita. Suurimpia poikkeavia arvoja saadaan siemenen koolla, joka saa suurimman osan arvoistaan hyvin kapealta väliltä, mutta </w:t>
+      </w:r>
+      <w:r>
+        <w:t xml:space="preserve">jossa on </w:t>
+      </w:r>
+      <w:r>
+        <w:t>myös paljon poikkeavia arvoja.</w:t>
       </w:r>
     </w:p>
     <w:p>
@@ -608,13 +590,31 @@
     </w:p>
     <w:p>
       <w:r>
-        <w:t>Taulukosta nähdään, että kaikkia yhdistelmiä kategorisia arvoja on olemassa datasetissä, joten joidenkin yhdistelmien puuttumista ei tarvitse ottaa huomioon loppuanalyysissä.</w:t>
+        <w:t>Taulukosta nähdään, että kaikkia yhdistelmiä kategorisia arvoja on olemassa datasetissä, joten joidenkin yhdistelmien puuttumista ei tarvitse ottaa huomioon</w:t>
+      </w:r>
+      <w:r>
+        <w:t xml:space="preserve"> jatkoanalyysissä</w:t>
+      </w:r>
+      <w:r>
+        <w:t>.</w:t>
       </w:r>
     </w:p>
     <w:p/>
     <w:p>
       <w:r>
-        <w:t>Seuraavaksi tutkitaan, ovatko numeeriset muuttujat normaalisti jakautuneita. Normaalisti jakautuneet muuttujat eivät sovellu suoraan ohjaamattomaan oppimiseen, koska niiden satunnaisuuden vuoksi niistä ei voi muodostaa selviä alueita. Lisäksi tilastollisten testien valinta edellyttää tietoa datan normaalijakautuneisuudesta. Käytetään Shapiro-Wilkin normaalisuustestiä numeerisiin muuttujiin.</w:t>
+        <w:t xml:space="preserve">Seuraavaksi tutkitaan, ovatko numeeriset muuttujat normaalisti jakautuneita. Normaalisti jakautuneet muuttujat eivät sovellu suoraan ohjaamattomaan oppimiseen, koska niiden </w:t>
+      </w:r>
+      <w:r>
+        <w:t>tasaisen jakauman</w:t>
+      </w:r>
+      <w:r>
+        <w:t xml:space="preserve"> vuoksi niistä ei voi muodostaa selviä alueita</w:t>
+      </w:r>
+      <w:r>
+        <w:t xml:space="preserve"> helposti</w:t>
+      </w:r>
+      <w:r>
+        <w:t>. Lisäksi tilastollisten testien valinta edellyttää tietoa datan normaalijakautuneisuudesta. Käytetään Shapiro-Wilkin normaalisuustestiä numeerisiin muuttujiin.</w:t>
       </w:r>
     </w:p>
     <w:p>
@@ -661,28 +661,28 @@
     </w:p>
     <w:p>
       <w:r>
-        <w:t xml:space="preserve">Huomataan, että maan </w:t>
-      </w:r>
-      <w:proofErr w:type="spellStart"/>
-      <w:r>
-        <w:t>ph</w:t>
-      </w:r>
-      <w:proofErr w:type="spellEnd"/>
-      <w:r>
-        <w:t xml:space="preserve"> on normaalisti jakautunut, joten sitä ei käytetä lopullisen muuttujavektorin muuttujissa. Muut arvot eivät ole normaalisti jakautuneita, joka auttaa ohjaamattomassa oppimisessa.</w:t>
-      </w:r>
-    </w:p>
-    <w:p>
-      <w:r>
-        <w:t xml:space="preserve">Lasketaan numeeristen muuttujien korrelaatiokertoimet Spearmanin avulla. Valitaan </w:t>
-      </w:r>
-      <w:proofErr w:type="spellStart"/>
-      <w:r>
-        <w:t>Spearman</w:t>
-      </w:r>
-      <w:proofErr w:type="spellEnd"/>
-      <w:r>
-        <w:t>, koska muuttujat eivät ole normaalisti jakautuneita. Testin tuloksista havaitaan, kuinka paljon yhteisvaihtelua muuttujilla on. Vahvasti korreloituneet muuttujat sisältävät paljon samaa tietoa, joka voi heikentää ohjaamattoman oppimisen tuloksia.</w:t>
+        <w:t>Huomataan, että maan ph on normaalisti jakautunut, joten sitä ei käytetä lopullisen muuttujavektorin muuttujissa. Muut arvot eivät ole normaalisti jakautuneita, joka auttaa ohjaamattomassa oppimisessa.</w:t>
+      </w:r>
+    </w:p>
+    <w:p>
+      <w:r>
+        <w:t xml:space="preserve">Lasketaan numeeristen muuttujien korrelaatiokertoimet </w:t>
+      </w:r>
+      <w:r>
+        <w:t>Spearmanin järjestyskorrelaatiokertoimen</w:t>
+      </w:r>
+      <w:r>
+        <w:t xml:space="preserve"> avulla. Valitaan </w:t>
+      </w:r>
+      <w:r>
+        <w:t>järjestyskorrelaatio</w:t>
+      </w:r>
+      <w:r>
+        <w:t xml:space="preserve">, koska muuttujat eivät ole normaalisti jakautuneita. Testin tuloksista havaitaan, kuinka paljon yhteisvaihtelua muuttujilla </w:t>
+      </w:r>
+      <w:r>
+        <w:lastRenderedPageBreak/>
+        <w:t>on. Vahvasti korreloituneet muuttujat sisältävät paljon samaa tietoa, joka voi heikentää ohjaamattoman oppimisen tuloksia.</w:t>
       </w:r>
     </w:p>
     <w:p>
@@ -690,7 +690,6 @@
         <w:rPr>
           <w:noProof/>
         </w:rPr>
-        <w:lastRenderedPageBreak/>
         <w:drawing>
           <wp:inline distT="0" distB="0" distL="0" distR="0" wp14:anchorId="2D8106A2" wp14:editId="11ECF255">
             <wp:extent cx="4236662" cy="4500081"/>
@@ -730,36 +729,18 @@
     </w:p>
     <w:p>
       <w:r>
-        <w:t xml:space="preserve">Taulukosta nähdään seuraavien muuttujien olevan korreloituneita toistensa kanssa. Halkaisija-pituus, </w:t>
-      </w:r>
-      <w:proofErr w:type="gramStart"/>
-      <w:r>
-        <w:t>kaarna-pituus</w:t>
-      </w:r>
-      <w:proofErr w:type="gramEnd"/>
-      <w:r>
-        <w:t xml:space="preserve"> ja </w:t>
-      </w:r>
-      <w:proofErr w:type="gramStart"/>
-      <w:r>
-        <w:t>kaarna-halkaisija</w:t>
-      </w:r>
-      <w:proofErr w:type="gramEnd"/>
-      <w:r>
-        <w:t>. Huomataan näiden kolmen muuttujan olevan korreloituneita toistensa kanssa, joten muuttujavektorissa tulee olla vain yksi näistä samaan aikaan.</w:t>
-      </w:r>
-    </w:p>
-    <w:p>
-      <w:r>
-        <w:t xml:space="preserve">Lasketaan seuraavaksi kategoristen muuttujien korrelaation </w:t>
-      </w:r>
-      <w:proofErr w:type="spellStart"/>
-      <w:r>
-        <w:t>Khinin</w:t>
-      </w:r>
-      <w:proofErr w:type="spellEnd"/>
-      <w:r>
-        <w:t xml:space="preserve"> neliötestillä.</w:t>
+        <w:t>Taulukosta nähdään seuraavien muuttujien olevan korreloituneita toistensa kanssa. Halkaisija-pituus, kaarna-pituus ja kaarna-halkaisija. Huomataan näiden kolmen muuttujan olevan korreloituneita toistensa kanssa, joten muuttujavektorissa tulee olla vain yksi näistä samaan aikaan.</w:t>
+      </w:r>
+    </w:p>
+    <w:p>
+      <w:r>
+        <w:t>Lasketaan seuraavaksi kategoristen muuttujien korrelaation</w:t>
+      </w:r>
+      <w:r>
+        <w:t xml:space="preserve"> Khiin neliö -testillä</w:t>
+      </w:r>
+      <w:r>
+        <w:t>.</w:t>
       </w:r>
     </w:p>
     <w:p>
@@ -811,15 +792,34 @@
     </w:p>
     <w:p>
       <w:r>
-        <w:t xml:space="preserve">Lopuksi verrataan vielä kategoristen ja numeeristen muuttujien jakaumien eroa </w:t>
-      </w:r>
-      <w:proofErr w:type="spellStart"/>
-      <w:r>
-        <w:t>kruskal-walliksen</w:t>
-      </w:r>
-      <w:proofErr w:type="spellEnd"/>
-      <w:r>
-        <w:t xml:space="preserve"> testillä. Tämän testin tuloksena saadaan tietää, onko kahden eri muuttujan hajontojen ero merkittävä vai ei. Jos hajonnat ovat merkittäviä, halutaan molemmat muuttujavektoriin, koska eri hajonnat tuottavat parempia klustereita.</w:t>
+        <w:t xml:space="preserve">Lopuksi suoritetaan varianssianalyysi Kruskal-Wallis-testillä, koska data ei ole normaalisti jakautunutta sekä siinä on kategorisia muuttujia. </w:t>
+      </w:r>
+      <w:r>
+        <w:t>Tämän testin tuloksena saadaan tietää, onko kahden eri muuttujan</w:t>
+      </w:r>
+      <w:r>
+        <w:t xml:space="preserve"> varianssien</w:t>
+      </w:r>
+      <w:r>
+        <w:t xml:space="preserve"> ero merkittävä vai ei. Jos </w:t>
+      </w:r>
+      <w:r>
+        <w:t>varianssit</w:t>
+      </w:r>
+      <w:r>
+        <w:t xml:space="preserve"> ovat merkittäviä, halutaan molemmat muuttujavektoriin, koska eri</w:t>
+      </w:r>
+      <w:r>
+        <w:t xml:space="preserve"> suuret</w:t>
+      </w:r>
+      <w:r>
+        <w:t xml:space="preserve"> </w:t>
+      </w:r>
+      <w:r>
+        <w:t>muuttujien väliset varianssit</w:t>
+      </w:r>
+      <w:r>
+        <w:t xml:space="preserve"> tuottavat parempia klustereita.</w:t>
       </w:r>
     </w:p>
     <w:p>
@@ -867,31 +867,21 @@
     </w:p>
     <w:p>
       <w:r>
-        <w:t xml:space="preserve">Taulukosta nähdään kahden muuttujan yhdistelmän olevan tilastollisesti merkittävää. Nämä yhdistelmät ovat </w:t>
-      </w:r>
-      <w:proofErr w:type="gramStart"/>
-      <w:r>
-        <w:t>halkaisija-sieni</w:t>
-      </w:r>
-      <w:proofErr w:type="gramEnd"/>
-      <w:r>
-        <w:t xml:space="preserve"> ja </w:t>
-      </w:r>
-      <w:proofErr w:type="gramStart"/>
-      <w:r>
-        <w:t>kaarna-sieni</w:t>
-      </w:r>
-      <w:proofErr w:type="gramEnd"/>
-      <w:r>
-        <w:t xml:space="preserve">. Muuttujavektoria rakentaessa halutaan ainakin nämä yhdistelmät </w:t>
-      </w:r>
-      <w:proofErr w:type="gramStart"/>
-      <w:r>
-        <w:t>ottaa</w:t>
-      </w:r>
-      <w:proofErr w:type="gramEnd"/>
-      <w:r>
-        <w:t xml:space="preserve"> huomioon.</w:t>
+        <w:t>Taulukosta nähdään kahden muuttujan yhdistelmän olevan tilastollisesti merkittävää. Nämä yhdistelmät ovat halkaisija-sieni ja kaarna-sieni. Muuttujavektoria rakentaessa halutaan</w:t>
+      </w:r>
+      <w:r>
+        <w:t xml:space="preserve"> ottaa huomioon</w:t>
+      </w:r>
+      <w:r>
+        <w:t xml:space="preserve"> ainakin nämä yhdistelmät</w:t>
+      </w:r>
+      <w:r>
+        <w:t>.</w:t>
+      </w:r>
+    </w:p>
+    <w:p>
+      <w:r>
+        <w:t>Lopputuloksena datasta on löytynyt muuttujia, jotka sopivat paremmin ja huonommin ohjaamattomaan oppimiseen. Esimerkiksi maan ph-arvoa ei käytetä ohjaamattomassa oppimisessa sen normaalijakautuneisuuden vuoksi sekä vahvasti korreloituneita muuttujia ei käytetä toistensa kanssa.</w:t>
       </w:r>
     </w:p>
     <w:p>
@@ -915,27 +905,18 @@
     </w:p>
     <w:p>
       <w:r>
-        <w:t xml:space="preserve">Ohjaamattomassa oppimisessa on tärkeää muodostaa ominaisuusvektori, jonka avulla </w:t>
-      </w:r>
-      <w:proofErr w:type="spellStart"/>
-      <w:r>
-        <w:t>klusterointia</w:t>
-      </w:r>
-      <w:proofErr w:type="spellEnd"/>
-      <w:r>
-        <w:t xml:space="preserve"> voidaan tehdä. Tähän ominaisuusvektoriin valitaan muuttujia, joilla on pieni yhteinen korrelaatio ja suuri muuttujien välinen ero. Näin saadaan valittua muuttujat, jotka kuvaavat mahdollisimman hyvin merkittäviä ominaisuuksia ja poistetaan ylimääräistä dataa, joka johtaa ohjaamattomassa oppimisessa helposti huonoihin tuloksiin.</w:t>
-      </w:r>
-    </w:p>
-    <w:p>
-      <w:r>
-        <w:t>Edellisten tilastollisten testien perusteella tiedetään, että pituudella, halkaisijalla ja kaarnan paksuudella on suuri korrelaatio toistensa kanssa. Niillä on myös suuret erot sienien ja värin kanssa. Rakennetaan ominaisuusvektori kolmesta muuttujasta.</w:t>
-      </w:r>
-      <w:r>
-        <w:rPr>
-          <w:noProof/>
-        </w:rPr>
-        <w:t xml:space="preserve"> </w:t>
-      </w:r>
+        <w:t>Ohjaamattomassa oppimisessa on tärkeää muodostaa ominaisuusvektori, jonka avulla klusterointia voidaan tehdä. Tähän ominaisuusvektoriin valitaan muuttujia, joilla on pieni yhteinen korrelaatio ja suuri muuttujien välinen ero. Näin saadaan valittua muuttujat, jotka kuvaavat mahdollisimman hyvin merkittäviä ominaisuuksia ja poistetaan ylimääräistä dataa, joka johtaa ohjaamattomassa oppimisessa helposti huonoihin tuloksiin.</w:t>
+      </w:r>
+    </w:p>
+    <w:p>
+      <w:r>
+        <w:t>Edellisten tilastollisten testien perusteella tiedetään, että pituudella, halkaisijalla ja kaarnan paksuudella on suuri korrelaatio toistensa kanssa.</w:t>
+      </w:r>
+      <w:r>
+        <w:t xml:space="preserve"> Valitaan toinen ominaisuus kategorisista muuttujista. Valitaan kolmas ominaisuus jäljelle jääneistä ei normaalisti jakautuneista muuttujista.</w:t>
+      </w:r>
+    </w:p>
+    <w:p>
       <w:r>
         <w:rPr>
           <w:noProof/>
@@ -979,6 +960,7 @@
     </w:p>
     <w:p>
       <w:r>
+        <w:lastRenderedPageBreak/>
         <w:t>Kaikkien näiden muuttujien yhdistelmistä muodostuu lista ominaisuusvektoreita, joissa on kaikissa kolme uniikkia yhdistelmää näitä kolmea ominaisuutta.</w:t>
       </w:r>
     </w:p>
@@ -992,40 +974,13 @@
     </w:p>
     <w:p>
       <w:r>
-        <w:lastRenderedPageBreak/>
-        <w:t xml:space="preserve">Gower-etäisyyttä ei voi käyttää suoraan kaikkien klusterointimenetelmien kanssa, joten valitaan yhteensopiva menetelmä tämän perusteella. Hierarchical Density-Based Spatial Clustering of Applications with Noise on klusterointialgoritmi, jonka avulla luokitellaan samanlaisia pisteitä. </w:t>
-      </w:r>
-      <w:proofErr w:type="spellStart"/>
-      <w:r>
-        <w:t>Hdbscan</w:t>
-      </w:r>
-      <w:proofErr w:type="spellEnd"/>
-      <w:r>
-        <w:t xml:space="preserve"> toimii datalla, jossa on poikkeavia arvoja ja se valitsee parhaan klusteroinnin useasta parametristä </w:t>
-      </w:r>
-      <w:proofErr w:type="spellStart"/>
-      <w:r>
-        <w:t>hierarkisesti</w:t>
-      </w:r>
-      <w:proofErr w:type="spellEnd"/>
-      <w:r>
-        <w:t xml:space="preserve">, joten sen kouluttaminen on helpompaa kuin </w:t>
-      </w:r>
-      <w:proofErr w:type="spellStart"/>
-      <w:r>
-        <w:t>dbscan</w:t>
-      </w:r>
-      <w:proofErr w:type="spellEnd"/>
-      <w:r>
-        <w:t xml:space="preserve">-klusteroinnin. Tärkein ominaisuus tässä tilanteessa on sen kyky käyttää Gower-etäisyyttä </w:t>
-      </w:r>
-      <w:proofErr w:type="spellStart"/>
-      <w:r>
-        <w:t>natiivisti</w:t>
-      </w:r>
-      <w:proofErr w:type="spellEnd"/>
-      <w:r>
-        <w:t>.</w:t>
+        <w:t xml:space="preserve">Gower-etäisyyttä ei voi käyttää suoraan kaikkien klusterointimenetelmien kanssa, joten valitaan yhteensopiva menetelmä tämän perusteella. Hierarchical Density-Based Spatial Clustering of Applications with Noise on klusterointialgoritmi, jonka avulla luokitellaan samanlaisia pisteitä. Hdbscan toimii datalla, jossa on poikkeavia arvoja ja se valitsee parhaan klusteroinnin useasta parametristä </w:t>
+      </w:r>
+      <w:r>
+        <w:t>hierarkkisesti</w:t>
+      </w:r>
+      <w:r>
+        <w:t>, joten sen kouluttaminen on helpompaa kuin dbscan-klusteroinnin. Tärkein ominaisuus tässä tilanteessa on sen kyky käyttää Gower-etäisyyttä natiivisti.</w:t>
       </w:r>
     </w:p>
     <w:p>
@@ -1072,48 +1027,26 @@
     </w:p>
     <w:p>
       <w:r>
-        <w:t xml:space="preserve">Koulutetaan </w:t>
-      </w:r>
-      <w:proofErr w:type="spellStart"/>
-      <w:r>
-        <w:t>hdbscan</w:t>
-      </w:r>
-      <w:proofErr w:type="spellEnd"/>
-      <w:r>
-        <w:t xml:space="preserve"> eri kokoisilla klustereilla ja eri toleransseilla </w:t>
+        <w:t xml:space="preserve">Koulutetaan hdbscan eri kokoisilla klustereilla ja eri toleransseilla </w:t>
       </w:r>
       <w:r>
         <w:t xml:space="preserve">poikkeaviin arvoihin. Klusterin koon valinta vaikuttaa </w:t>
       </w:r>
-      <w:proofErr w:type="spellStart"/>
-      <w:r>
-        <w:t>hdbscan:iin</w:t>
-      </w:r>
-      <w:proofErr w:type="spellEnd"/>
-      <w:r>
-        <w:t xml:space="preserve"> merkittävästi ja </w:t>
-      </w:r>
-      <w:proofErr w:type="spellStart"/>
-      <w:r>
-        <w:t>sample_range</w:t>
-      </w:r>
-      <w:proofErr w:type="spellEnd"/>
-      <w:r>
-        <w:t xml:space="preserve"> </w:t>
-      </w:r>
-      <w:proofErr w:type="gramStart"/>
-      <w:r>
-        <w:t>kertoo kuinka herkkä menetelmä on</w:t>
-      </w:r>
-      <w:proofErr w:type="gramEnd"/>
-      <w:r>
-        <w:t xml:space="preserve"> </w:t>
-      </w:r>
-      <w:proofErr w:type="spellStart"/>
-      <w:r>
-        <w:t>poikkeville</w:t>
-      </w:r>
-      <w:proofErr w:type="spellEnd"/>
+      <w:r>
+        <w:t>hdbscan: iin</w:t>
+      </w:r>
+      <w:r>
+        <w:t xml:space="preserve"> merkittävästi ja sample_range kertoo</w:t>
+      </w:r>
+      <w:r>
+        <w:t>,</w:t>
+      </w:r>
+      <w:r>
+        <w:t xml:space="preserve"> kuinka herkkä menetelmä on </w:t>
+      </w:r>
+      <w:r>
+        <w:t>poikkeaville</w:t>
+      </w:r>
       <w:r>
         <w:t xml:space="preserve"> arvoille.</w:t>
       </w:r>
@@ -1162,43 +1095,26 @@
     </w:p>
     <w:p>
       <w:r>
-        <w:t xml:space="preserve">Tuloksena parhaan siluettiarvon saa halkaisija, sienien läheisyys ja siemenen koon muuttujista koostuva ominaisuusvektori. Klustereita on kolme ja poikkeavia arvoja on 4, joka on hyvä tulos tälle menetelmälle. Tarkastellaan tulosta </w:t>
-      </w:r>
-      <w:proofErr w:type="spellStart"/>
-      <w:r>
-        <w:t>mds</w:t>
-      </w:r>
-      <w:proofErr w:type="spellEnd"/>
-      <w:r>
-        <w:t xml:space="preserve"> ja </w:t>
-      </w:r>
-      <w:proofErr w:type="spellStart"/>
-      <w:r>
-        <w:t>tsne</w:t>
-      </w:r>
-      <w:proofErr w:type="spellEnd"/>
-      <w:r>
-        <w:t xml:space="preserve"> projektioiden avulla. Nämä projektiot pystyvät näyttämään korkeaulotteisen datan kaksiulotteisena, jolloin sitä on mielekästä tarkastella. Tähän selitys MDS </w:t>
-      </w:r>
-      <w:proofErr w:type="spellStart"/>
-      <w:r>
-        <w:t>vs</w:t>
-      </w:r>
-      <w:proofErr w:type="spellEnd"/>
-      <w:r>
-        <w:t xml:space="preserve"> TSNE</w:t>
-      </w:r>
-    </w:p>
-    <w:p>
+        <w:t>Tuloksena parhaan siluettiarvon saa halkaisija, sienien läheisyys ja siemenen koon muuttujista koostuva ominaisuusvektori. Klustereita on kolme ja poikkeavia arvoja on 4, joka on hyvä tulos tälle menetelmälle. Tarkastellaan tulosta</w:t>
+      </w:r>
+      <w:r>
+        <w:t xml:space="preserve"> kahdella eri ulottuvuuden rajoittavalla projektiolla. Ensimmäinen näistä on multidimensional scaling, joka pyrkii säilyttämään datapisteiden globaalit etäisyydet. Toinen tekniikka on T-distributed stochastic neighbor embedding, joka pyrkii säilyttämään datapisteiden lokaalit etäisyydet.</w:t>
+      </w:r>
       <w:r>
         <w:rPr>
           <w:noProof/>
         </w:rPr>
+        <w:t xml:space="preserve"> </w:t>
+      </w:r>
+      <w:r>
+        <w:rPr>
+          <w:noProof/>
+        </w:rPr>
         <w:drawing>
-          <wp:inline distT="0" distB="0" distL="0" distR="0" wp14:anchorId="71FA9F34" wp14:editId="36EFA785">
-            <wp:extent cx="5730240" cy="2199640"/>
-            <wp:effectExtent l="0" t="0" r="3810" b="0"/>
-            <wp:docPr id="180027617" name="Picture 1"/>
+          <wp:inline distT="0" distB="0" distL="0" distR="0" wp14:anchorId="241DB970" wp14:editId="6698F224">
+            <wp:extent cx="5731510" cy="2199005"/>
+            <wp:effectExtent l="0" t="0" r="2540" b="0"/>
+            <wp:docPr id="934634686" name="Picture 1"/>
             <wp:cNvGraphicFramePr>
               <a:graphicFrameLocks xmlns:a="http://schemas.openxmlformats.org/drawingml/2006/main" noChangeAspect="1"/>
             </wp:cNvGraphicFramePr>
@@ -1206,36 +1122,23 @@
               <a:graphicData uri="http://schemas.openxmlformats.org/drawingml/2006/picture">
                 <pic:pic xmlns:pic="http://schemas.openxmlformats.org/drawingml/2006/picture">
                   <pic:nvPicPr>
-                    <pic:cNvPr id="0" name="Picture 1"/>
-                    <pic:cNvPicPr>
-                      <a:picLocks noChangeAspect="1" noChangeArrowheads="1"/>
-                    </pic:cNvPicPr>
+                    <pic:cNvPr id="934634686" name=""/>
+                    <pic:cNvPicPr/>
                   </pic:nvPicPr>
                   <pic:blipFill>
-                    <a:blip r:embed="rId24" cstate="print">
-                      <a:extLst>
-                        <a:ext uri="{28A0092B-C50C-407E-A947-70E740481C1C}">
-                          <a14:useLocalDpi xmlns:a14="http://schemas.microsoft.com/office/drawing/2010/main" val="0"/>
-                        </a:ext>
-                      </a:extLst>
-                    </a:blip>
-                    <a:srcRect/>
+                    <a:blip r:embed="rId24"/>
                     <a:stretch>
                       <a:fillRect/>
                     </a:stretch>
                   </pic:blipFill>
-                  <pic:spPr bwMode="auto">
+                  <pic:spPr>
                     <a:xfrm>
                       <a:off x="0" y="0"/>
-                      <a:ext cx="5730240" cy="2199640"/>
+                      <a:ext cx="5731510" cy="2199005"/>
                     </a:xfrm>
                     <a:prstGeom prst="rect">
                       <a:avLst/>
                     </a:prstGeom>
-                    <a:noFill/>
-                    <a:ln>
-                      <a:noFill/>
-                    </a:ln>
                   </pic:spPr>
                 </pic:pic>
               </a:graphicData>
@@ -1246,15 +1149,40 @@
     </w:p>
     <w:p>
       <w:r>
+        <w:lastRenderedPageBreak/>
+        <w:t xml:space="preserve">Kuvasta nähdään visuaalisesti kaksi eri tapaa projektoida korkeaulotteinen data kahteen ulottuvuuteen ja pisteiden väritys saatiin hdbscan-menetelmällä. Huomataan värityksen </w:t>
+      </w:r>
+      <w:r>
+        <w:t>sopivan melko hyvin klustereihin, joka kertoo klusteroinnin onnistumisesta.</w:t>
+      </w:r>
+    </w:p>
+    <w:p>
+      <w:r>
+        <w:t xml:space="preserve">Seuraavaksi </w:t>
+      </w:r>
+      <w:r>
+        <w:t xml:space="preserve">sovitetaan hdbscan-menetelmät tuottamat arvaukset biologien arvauksiin. Ongelmana on, että biologien arvaukset ja klusteroinnin tuottamat arvaukset eivät välttämättä ole kuvattu samoilla numeroilla. Pitää selvittää mitkä tutkijoiden arvaukset sopivat parhaiten klusteroinnin arvauksiin. Käytetään tähän </w:t>
+      </w:r>
+      <w:r>
+        <w:t>unkarilaista</w:t>
+      </w:r>
+      <w:r>
+        <w:t xml:space="preserve"> algoritmia sekä</w:t>
+      </w:r>
+      <w:r>
+        <w:t xml:space="preserve"> ristitaulukkoa.</w:t>
+      </w:r>
+    </w:p>
+    <w:p>
+      <w:r>
         <w:rPr>
           <w:noProof/>
         </w:rPr>
-        <w:lastRenderedPageBreak/>
         <w:drawing>
-          <wp:inline distT="0" distB="0" distL="0" distR="0" wp14:anchorId="5376BFB2" wp14:editId="09048342">
-            <wp:extent cx="5730240" cy="2199640"/>
-            <wp:effectExtent l="0" t="0" r="3810" b="0"/>
-            <wp:docPr id="1220515023" name="Picture 2"/>
+          <wp:inline distT="0" distB="0" distL="0" distR="0" wp14:anchorId="04ECBD43" wp14:editId="07C8DBC5">
+            <wp:extent cx="2644214" cy="1635760"/>
+            <wp:effectExtent l="0" t="0" r="3810" b="2540"/>
+            <wp:docPr id="2026493009" name="Picture 1"/>
             <wp:cNvGraphicFramePr>
               <a:graphicFrameLocks xmlns:a="http://schemas.openxmlformats.org/drawingml/2006/main" noChangeAspect="1"/>
             </wp:cNvGraphicFramePr>
@@ -1262,42 +1190,403 @@
               <a:graphicData uri="http://schemas.openxmlformats.org/drawingml/2006/picture">
                 <pic:pic xmlns:pic="http://schemas.openxmlformats.org/drawingml/2006/picture">
                   <pic:nvPicPr>
-                    <pic:cNvPr id="0" name="Picture 2"/>
-                    <pic:cNvPicPr>
-                      <a:picLocks noChangeAspect="1" noChangeArrowheads="1"/>
-                    </pic:cNvPicPr>
+                    <pic:cNvPr id="2026493009" name=""/>
+                    <pic:cNvPicPr/>
                   </pic:nvPicPr>
                   <pic:blipFill>
-                    <a:blip r:embed="rId25" cstate="print">
-                      <a:extLst>
-                        <a:ext uri="{28A0092B-C50C-407E-A947-70E740481C1C}">
-                          <a14:useLocalDpi xmlns:a14="http://schemas.microsoft.com/office/drawing/2010/main" val="0"/>
-                        </a:ext>
-                      </a:extLst>
-                    </a:blip>
-                    <a:srcRect/>
+                    <a:blip r:embed="rId25"/>
                     <a:stretch>
                       <a:fillRect/>
                     </a:stretch>
                   </pic:blipFill>
-                  <pic:spPr bwMode="auto">
+                  <pic:spPr>
                     <a:xfrm>
                       <a:off x="0" y="0"/>
-                      <a:ext cx="5730240" cy="2199640"/>
+                      <a:ext cx="2645518" cy="1636567"/>
                     </a:xfrm>
                     <a:prstGeom prst="rect">
                       <a:avLst/>
                     </a:prstGeom>
-                    <a:noFill/>
-                    <a:ln>
-                      <a:noFill/>
-                    </a:ln>
                   </pic:spPr>
                 </pic:pic>
               </a:graphicData>
             </a:graphic>
           </wp:inline>
         </w:drawing>
+      </w:r>
+    </w:p>
+    <w:p>
+      <w:pPr>
+        <w:rPr>
+          <w:noProof/>
+        </w:rPr>
+      </w:pPr>
+      <w:r>
+        <w:t xml:space="preserve">Ristitaulukosta nähdään mitkä luokat ovat yhteydessä toisiinsa. Jokaisesta sarakkeesta valitaan suurin arvo, jonka avulla saadaan suurin sopivuus. Tästä taulukosta saadaan seuraava muutos 0 </w:t>
+      </w:r>
+      <w:r>
+        <w:sym w:font="Wingdings" w:char="F0E0"/>
+      </w:r>
+      <w:r>
+        <w:t xml:space="preserve"> 2., 1 </w:t>
+      </w:r>
+      <w:r>
+        <w:sym w:font="Wingdings" w:char="F0E0"/>
+      </w:r>
+      <w:r>
+        <w:t xml:space="preserve"> 1., 2 </w:t>
+      </w:r>
+      <w:r>
+        <w:sym w:font="Wingdings" w:char="F0E0"/>
+      </w:r>
+      <w:r>
+        <w:t xml:space="preserve"> 3. Tämä tuottaa parhaan mahdollisen sovituksen näiden luokittelujen välillä, joka on 46,74 %. Tämän muutoksen avulla tutkijoiden ja klusteroinnin arvaukset ovat verrattavissa toisiinsa.</w:t>
+      </w:r>
+    </w:p>
+    <w:p>
+      <w:pPr>
+        <w:rPr>
+          <w:noProof/>
+        </w:rPr>
+      </w:pPr>
+      <w:r>
+        <w:rPr>
+          <w:noProof/>
+        </w:rPr>
+        <w:t>Sovitetaan tutkijoiden arvaukset klustereihin.</w:t>
+      </w:r>
+    </w:p>
+    <w:p>
+      <w:pPr>
+        <w:rPr>
+          <w:noProof/>
+        </w:rPr>
+      </w:pPr>
+      <w:r>
+        <w:rPr>
+          <w:noProof/>
+        </w:rPr>
+        <w:drawing>
+          <wp:inline distT="0" distB="0" distL="0" distR="0" wp14:anchorId="2CA48540" wp14:editId="0F5B9874">
+            <wp:extent cx="5731510" cy="2199005"/>
+            <wp:effectExtent l="0" t="0" r="2540" b="0"/>
+            <wp:docPr id="1251691390" name="Picture 1"/>
+            <wp:cNvGraphicFramePr>
+              <a:graphicFrameLocks xmlns:a="http://schemas.openxmlformats.org/drawingml/2006/main" noChangeAspect="1"/>
+            </wp:cNvGraphicFramePr>
+            <a:graphic xmlns:a="http://schemas.openxmlformats.org/drawingml/2006/main">
+              <a:graphicData uri="http://schemas.openxmlformats.org/drawingml/2006/picture">
+                <pic:pic xmlns:pic="http://schemas.openxmlformats.org/drawingml/2006/picture">
+                  <pic:nvPicPr>
+                    <pic:cNvPr id="1251691390" name=""/>
+                    <pic:cNvPicPr/>
+                  </pic:nvPicPr>
+                  <pic:blipFill>
+                    <a:blip r:embed="rId26"/>
+                    <a:stretch>
+                      <a:fillRect/>
+                    </a:stretch>
+                  </pic:blipFill>
+                  <pic:spPr>
+                    <a:xfrm>
+                      <a:off x="0" y="0"/>
+                      <a:ext cx="5731510" cy="2199005"/>
+                    </a:xfrm>
+                    <a:prstGeom prst="rect">
+                      <a:avLst/>
+                    </a:prstGeom>
+                  </pic:spPr>
+                </pic:pic>
+              </a:graphicData>
+            </a:graphic>
+          </wp:inline>
+        </w:drawing>
+      </w:r>
+    </w:p>
+    <w:p>
+      <w:pPr>
+        <w:rPr>
+          <w:noProof/>
+        </w:rPr>
+      </w:pPr>
+      <w:r>
+        <w:rPr>
+          <w:noProof/>
+        </w:rPr>
+        <w:t xml:space="preserve">Huomataan jonkin verran yhtäläisyyksiä, mutta moni luokittelu on silti eri kuin klusteroinnissa. Lasketaan tutkijoiden arvauksille seuraavat tilastot tosien arvausten määrä, accuracy ja recall. Accuracy on oikein luokiteltujen määrän suhde kaikkiin luokitteluihin ja recall on oikein luokiteltujen suhde oikein ja väärin luokiteltuihin. Tässä tapauksessa puun väärin luokittelu ei ole vakavaa, joten annetaan suurempi painoarvo accuracylle. </w:t>
+      </w:r>
+    </w:p>
+    <w:p>
+      <w:pPr>
+        <w:rPr>
+          <w:noProof/>
+        </w:rPr>
+      </w:pPr>
+      <w:r>
+        <w:rPr>
+          <w:noProof/>
+        </w:rPr>
+        <w:drawing>
+          <wp:inline distT="0" distB="0" distL="0" distR="0" wp14:anchorId="37558246" wp14:editId="22E478B9">
+            <wp:extent cx="5331642" cy="965200"/>
+            <wp:effectExtent l="0" t="0" r="2540" b="6350"/>
+            <wp:docPr id="16515057" name="Picture 1"/>
+            <wp:cNvGraphicFramePr>
+              <a:graphicFrameLocks xmlns:a="http://schemas.openxmlformats.org/drawingml/2006/main" noChangeAspect="1"/>
+            </wp:cNvGraphicFramePr>
+            <a:graphic xmlns:a="http://schemas.openxmlformats.org/drawingml/2006/main">
+              <a:graphicData uri="http://schemas.openxmlformats.org/drawingml/2006/picture">
+                <pic:pic xmlns:pic="http://schemas.openxmlformats.org/drawingml/2006/picture">
+                  <pic:nvPicPr>
+                    <pic:cNvPr id="16515057" name=""/>
+                    <pic:cNvPicPr/>
+                  </pic:nvPicPr>
+                  <pic:blipFill>
+                    <a:blip r:embed="rId27"/>
+                    <a:stretch>
+                      <a:fillRect/>
+                    </a:stretch>
+                  </pic:blipFill>
+                  <pic:spPr>
+                    <a:xfrm>
+                      <a:off x="0" y="0"/>
+                      <a:ext cx="5545210" cy="1003863"/>
+                    </a:xfrm>
+                    <a:prstGeom prst="rect">
+                      <a:avLst/>
+                    </a:prstGeom>
+                  </pic:spPr>
+                </pic:pic>
+              </a:graphicData>
+            </a:graphic>
+          </wp:inline>
+        </w:drawing>
+      </w:r>
+    </w:p>
+    <w:p>
+      <w:r>
+        <w:lastRenderedPageBreak/>
+        <w:t>Kuvasta huomataan kaikkien biologien tunnistavan puita paremmin kuin arvaamalla satunnaisesti. Jos oletetaan, että luokkia on vain kolme, oikea arvaus tulee todennäköisyydellä 33 % ja kaikkien biologien tarkkuus oli tätä suurempaa. Tarkin biologi on 3, 52 % tarkkuudella ja epätarkin on biologi 2, 42 % tarkkuudella.</w:t>
+      </w:r>
+    </w:p>
+    <w:p>
+      <w:pPr>
+        <w:pStyle w:val="Heading2"/>
+        <w:rPr>
+          <w:lang w:val="fi-FI"/>
+        </w:rPr>
+      </w:pPr>
+      <w:r>
+        <w:rPr>
+          <w:lang w:val="fi-FI"/>
+        </w:rPr>
+        <w:t>3 Loppupäätelmät</w:t>
+      </w:r>
+    </w:p>
+    <w:p>
+      <w:r>
+        <w:t>Ensimmäinen tutkimuskysymys on</w:t>
+      </w:r>
+      <w:r>
+        <w:t>,</w:t>
+      </w:r>
+      <w:r>
+        <w:t xml:space="preserve"> kuka biologeista luokitteli puut parhaiten. Perustuen klusterointiin ja parhaaseen mahdolliseen sovitukseen biologien luokkien ja klusteroinnin luokkien välillä, biologi 3 on paras luokittelemaan puita näiden tilastojen perusteella.</w:t>
+      </w:r>
+    </w:p>
+    <w:p>
+      <w:r>
+        <w:t>Toinen tutkimuskysymys</w:t>
+      </w:r>
+      <w:r>
+        <w:t xml:space="preserve"> on</w:t>
+      </w:r>
+      <w:r>
+        <w:t>, mitkä muuttujat luokittelevat datan parhaiten. Perustuen tilastollisiin menetelmiin, voidaan sanoa parhaiksi muuttujiksi halkaisijan, pituuden, kaarnan paksuuden ja sienien läheisyyden. Tämä perustuu Kruskal-Wallis-testin tuloksiin. Heikoin muuttuja on maan ph-arvo, koska se on normaalisti jakautunut.</w:t>
+      </w:r>
+    </w:p>
+    <w:p>
+      <w:r>
+        <w:t>Nämä johtopäätökset pitävät melko hyvin paikkaansa klusteroinnin tuloksissa, joissa parhaan tuloksen sai halkaisija, sienien läheisyys ja siemenen koko. Mutta maan ph-arvo saa myös hyviä klusterointituloksia kaarnan paksuuden ja sienien läheisyyden kanssa.</w:t>
+      </w:r>
+    </w:p>
+    <w:p>
+      <w:r>
+        <w:rPr>
+          <w:noProof/>
+        </w:rPr>
+        <w:drawing>
+          <wp:inline distT="0" distB="0" distL="0" distR="0" wp14:anchorId="0EE5DF32" wp14:editId="21E68A25">
+            <wp:extent cx="3570781" cy="1788160"/>
+            <wp:effectExtent l="0" t="0" r="0" b="2540"/>
+            <wp:docPr id="957951581" name="Picture 1"/>
+            <wp:cNvGraphicFramePr>
+              <a:graphicFrameLocks xmlns:a="http://schemas.openxmlformats.org/drawingml/2006/main" noChangeAspect="1"/>
+            </wp:cNvGraphicFramePr>
+            <a:graphic xmlns:a="http://schemas.openxmlformats.org/drawingml/2006/main">
+              <a:graphicData uri="http://schemas.openxmlformats.org/drawingml/2006/picture">
+                <pic:pic xmlns:pic="http://schemas.openxmlformats.org/drawingml/2006/picture">
+                  <pic:nvPicPr>
+                    <pic:cNvPr id="957951581" name=""/>
+                    <pic:cNvPicPr/>
+                  </pic:nvPicPr>
+                  <pic:blipFill>
+                    <a:blip r:embed="rId28"/>
+                    <a:stretch>
+                      <a:fillRect/>
+                    </a:stretch>
+                  </pic:blipFill>
+                  <pic:spPr>
+                    <a:xfrm>
+                      <a:off x="0" y="0"/>
+                      <a:ext cx="3571087" cy="1788313"/>
+                    </a:xfrm>
+                    <a:prstGeom prst="rect">
+                      <a:avLst/>
+                    </a:prstGeom>
+                  </pic:spPr>
+                </pic:pic>
+              </a:graphicData>
+            </a:graphic>
+          </wp:inline>
+        </w:drawing>
+      </w:r>
+      <w:r>
+        <w:rPr>
+          <w:noProof/>
+        </w:rPr>
+        <w:drawing>
+          <wp:inline distT="0" distB="0" distL="0" distR="0" wp14:anchorId="0ABD6B7D" wp14:editId="0CBE75E4">
+            <wp:extent cx="772160" cy="1786678"/>
+            <wp:effectExtent l="0" t="0" r="8890" b="4445"/>
+            <wp:docPr id="1683153037" name="Picture 1"/>
+            <wp:cNvGraphicFramePr>
+              <a:graphicFrameLocks xmlns:a="http://schemas.openxmlformats.org/drawingml/2006/main" noChangeAspect="1"/>
+            </wp:cNvGraphicFramePr>
+            <a:graphic xmlns:a="http://schemas.openxmlformats.org/drawingml/2006/main">
+              <a:graphicData uri="http://schemas.openxmlformats.org/drawingml/2006/picture">
+                <pic:pic xmlns:pic="http://schemas.openxmlformats.org/drawingml/2006/picture">
+                  <pic:nvPicPr>
+                    <pic:cNvPr id="1683153037" name=""/>
+                    <pic:cNvPicPr/>
+                  </pic:nvPicPr>
+                  <pic:blipFill>
+                    <a:blip r:embed="rId29"/>
+                    <a:stretch>
+                      <a:fillRect/>
+                    </a:stretch>
+                  </pic:blipFill>
+                  <pic:spPr>
+                    <a:xfrm>
+                      <a:off x="0" y="0"/>
+                      <a:ext cx="799438" cy="1849795"/>
+                    </a:xfrm>
+                    <a:prstGeom prst="rect">
+                      <a:avLst/>
+                    </a:prstGeom>
+                  </pic:spPr>
+                </pic:pic>
+              </a:graphicData>
+            </a:graphic>
+          </wp:inline>
+        </w:drawing>
+      </w:r>
+    </w:p>
+    <w:p>
+      <w:r>
+        <w:t>Toiset muuttujat saavat puolestaan paljon huonoja klusterointituloksia.</w:t>
+      </w:r>
+    </w:p>
+    <w:p>
+      <w:r>
+        <w:rPr>
+          <w:noProof/>
+        </w:rPr>
+        <w:drawing>
+          <wp:inline distT="0" distB="0" distL="0" distR="0" wp14:anchorId="6C5BB054" wp14:editId="1160B238">
+            <wp:extent cx="3332480" cy="1687284"/>
+            <wp:effectExtent l="0" t="0" r="1270" b="8255"/>
+            <wp:docPr id="1782946340" name="Picture 1"/>
+            <wp:cNvGraphicFramePr>
+              <a:graphicFrameLocks xmlns:a="http://schemas.openxmlformats.org/drawingml/2006/main" noChangeAspect="1"/>
+            </wp:cNvGraphicFramePr>
+            <a:graphic xmlns:a="http://schemas.openxmlformats.org/drawingml/2006/main">
+              <a:graphicData uri="http://schemas.openxmlformats.org/drawingml/2006/picture">
+                <pic:pic xmlns:pic="http://schemas.openxmlformats.org/drawingml/2006/picture">
+                  <pic:nvPicPr>
+                    <pic:cNvPr id="1782946340" name=""/>
+                    <pic:cNvPicPr/>
+                  </pic:nvPicPr>
+                  <pic:blipFill>
+                    <a:blip r:embed="rId30"/>
+                    <a:stretch>
+                      <a:fillRect/>
+                    </a:stretch>
+                  </pic:blipFill>
+                  <pic:spPr>
+                    <a:xfrm>
+                      <a:off x="0" y="0"/>
+                      <a:ext cx="3343292" cy="1692758"/>
+                    </a:xfrm>
+                    <a:prstGeom prst="rect">
+                      <a:avLst/>
+                    </a:prstGeom>
+                  </pic:spPr>
+                </pic:pic>
+              </a:graphicData>
+            </a:graphic>
+          </wp:inline>
+        </w:drawing>
+      </w:r>
+      <w:r>
+        <w:rPr>
+          <w:noProof/>
+        </w:rPr>
+        <w:drawing>
+          <wp:inline distT="0" distB="0" distL="0" distR="0" wp14:anchorId="03648319" wp14:editId="264CA836">
+            <wp:extent cx="715882" cy="1717040"/>
+            <wp:effectExtent l="0" t="0" r="8255" b="0"/>
+            <wp:docPr id="1545479123" name="Picture 1"/>
+            <wp:cNvGraphicFramePr>
+              <a:graphicFrameLocks xmlns:a="http://schemas.openxmlformats.org/drawingml/2006/main" noChangeAspect="1"/>
+            </wp:cNvGraphicFramePr>
+            <a:graphic xmlns:a="http://schemas.openxmlformats.org/drawingml/2006/main">
+              <a:graphicData uri="http://schemas.openxmlformats.org/drawingml/2006/picture">
+                <pic:pic xmlns:pic="http://schemas.openxmlformats.org/drawingml/2006/picture">
+                  <pic:nvPicPr>
+                    <pic:cNvPr id="1545479123" name=""/>
+                    <pic:cNvPicPr/>
+                  </pic:nvPicPr>
+                  <pic:blipFill>
+                    <a:blip r:embed="rId31"/>
+                    <a:stretch>
+                      <a:fillRect/>
+                    </a:stretch>
+                  </pic:blipFill>
+                  <pic:spPr>
+                    <a:xfrm>
+                      <a:off x="0" y="0"/>
+                      <a:ext cx="718796" cy="1724029"/>
+                    </a:xfrm>
+                    <a:prstGeom prst="rect">
+                      <a:avLst/>
+                    </a:prstGeom>
+                  </pic:spPr>
+                </pic:pic>
+              </a:graphicData>
+            </a:graphic>
+          </wp:inline>
+        </w:drawing>
+      </w:r>
+    </w:p>
+    <w:p>
+      <w:r>
+        <w:t>Perustuen klusterointituloksiin, lehtien ja käpyjen määrä tuottavat huonoja klusterointituloksia.</w:t>
+      </w:r>
+    </w:p>
+    <w:p>
+      <w:r>
+        <w:t>Lopullinen päätelmä on siis, että lehtien määrä ja käpyjen määrä tuottavat huonoja klusterointituloksia, joten niiden kerääminen ei ole kannattavaa biologeille. Tämä käy myös intuitiivisesti järkeen, koska lehtien ja käpyjen laskeminen on haastavaa, jos ympäristöä ei ole kontrolloitu.</w:t>
       </w:r>
     </w:p>
     <w:sectPr>
@@ -2611,6 +2900,7 @@
   <w:style w:type="character" w:default="1" w:styleId="DefaultParagraphFont">
     <w:name w:val="Default Paragraph Font"/>
     <w:uiPriority w:val="1"/>
+    <w:semiHidden/>
     <w:unhideWhenUsed/>
   </w:style>
   <w:style w:type="table" w:default="1" w:styleId="TableNormal">

</xml_diff>